<commit_message>
Aggiunto use case e modifiche QDc
</commit_message>
<xml_diff>
--- a/1_QdC/QDC_SB-FiveNights.docx
+++ b/1_QdC/QDC_SB-FiveNights.docx
@@ -2945,14 +2945,7 @@
           <w:rFonts w:eastAsia="Times New Roman" w:cstheme="minorHAnsi"/>
           <w:lang w:val="it-CH" w:eastAsia="fr-FR"/>
         </w:rPr>
-        <w:t>L'antagonista VAL-Z avrà la capacità di effettuare un "hacking" dei blocchi di sicurezza (porte o accessi) che lo separano dal giocatore</w:t>
-      </w:r>
-      <w:r>
-        <w:rPr>
-          <w:rFonts w:eastAsia="Times New Roman" w:cstheme="minorHAnsi"/>
-          <w:lang w:val="it-CH" w:eastAsia="fr-FR"/>
-        </w:rPr>
-        <w:t>.</w:t>
+        <w:t>L'antagonista VAL-Z avrà la capacità di effettuare un "hacking" dei blocchi di sicurezza (porte o accessi) che lo separano dal giocatore.</w:t>
       </w:r>
     </w:p>
     <w:p>
@@ -3024,42 +3017,7 @@
           <w:rFonts w:eastAsia="Times New Roman" w:cstheme="minorHAnsi"/>
           <w:lang w:val="it-CH" w:eastAsia="fr-FR"/>
         </w:rPr>
-        <w:t>Sarà possibile attivare temporaneamente un Firewall localizzato nella zona</w:t>
-      </w:r>
-      <w:r>
-        <w:rPr>
-          <w:rFonts w:eastAsia="Times New Roman" w:cstheme="minorHAnsi"/>
-          <w:lang w:val="it-CH" w:eastAsia="fr-FR"/>
-        </w:rPr>
-        <w:t xml:space="preserve"> dell’ufficio</w:t>
-      </w:r>
-      <w:r>
-        <w:rPr>
-          <w:rFonts w:eastAsia="Times New Roman" w:cstheme="minorHAnsi"/>
-          <w:lang w:val="it-CH" w:eastAsia="fr-FR"/>
-        </w:rPr>
-        <w:t xml:space="preserve"> </w:t>
-      </w:r>
-      <w:r>
-        <w:rPr>
-          <w:rFonts w:eastAsia="Times New Roman" w:cstheme="minorHAnsi"/>
-          <w:lang w:val="it-CH" w:eastAsia="fr-FR"/>
-        </w:rPr>
-        <w:t>di sicurezza</w:t>
-      </w:r>
-      <w:r>
-        <w:rPr>
-          <w:rFonts w:eastAsia="Times New Roman" w:cstheme="minorHAnsi"/>
-          <w:lang w:val="it-CH" w:eastAsia="fr-FR"/>
-        </w:rPr>
-        <w:t xml:space="preserve"> per bloccare l'avanzata di VAL-Z</w:t>
-      </w:r>
-      <w:r>
-        <w:rPr>
-          <w:rFonts w:eastAsia="Times New Roman" w:cstheme="minorHAnsi"/>
-          <w:lang w:val="it-CH" w:eastAsia="fr-FR"/>
-        </w:rPr>
-        <w:t>.</w:t>
+        <w:t>Sarà possibile attivare temporaneamente un Firewall localizzato nella zona dell’ufficio di sicurezza per bloccare l'avanzata di VAL-Z.</w:t>
       </w:r>
     </w:p>
     <w:p>
@@ -3175,14 +3133,7 @@
           <w:rFonts w:eastAsia="Times New Roman" w:cstheme="minorHAnsi"/>
           <w:lang w:val="it-CH" w:eastAsia="fr-FR"/>
         </w:rPr>
-        <w:t>Durante l'animazione, il sistema dovrà inibire ogni input dell'utente (blocco tastiera/mouse) per garantire l'effetto scenico</w:t>
-      </w:r>
-      <w:r>
-        <w:rPr>
-          <w:rFonts w:eastAsia="Times New Roman" w:cstheme="minorHAnsi"/>
-          <w:lang w:val="it-CH" w:eastAsia="fr-FR"/>
-        </w:rPr>
-        <w:t>.</w:t>
+        <w:t>Durante l'animazione, il sistema dovrà inibire ogni input dell'utente (blocco tastiera/mouse) per garantire l'effetto scenico.</w:t>
       </w:r>
     </w:p>
     <w:p>
@@ -3610,7 +3561,14 @@
           <w:rFonts w:eastAsia="Times New Roman" w:cstheme="minorHAnsi"/>
           <w:lang w:val="it-CH" w:eastAsia="en-GB"/>
         </w:rPr>
-        <w:t>228 - Manuale utente</w:t>
+        <w:t>235 -</w:t>
+      </w:r>
+      <w:r>
+        <w:rPr>
+          <w:rFonts w:eastAsia="Times New Roman" w:cstheme="minorHAnsi"/>
+          <w:lang w:val="it-CH" w:eastAsia="en-GB"/>
+        </w:rPr>
+        <w:t xml:space="preserve"> Progettazione con UML</w:t>
       </w:r>
     </w:p>
     <w:p>
@@ -3631,14 +3589,28 @@
           <w:rFonts w:eastAsia="Times New Roman" w:cstheme="minorHAnsi"/>
           <w:lang w:val="it-CH" w:eastAsia="en-GB"/>
         </w:rPr>
-        <w:t>231</w:t>
+        <w:t>16</w:t>
       </w:r>
       <w:r>
         <w:rPr>
           <w:rFonts w:eastAsia="Times New Roman" w:cstheme="minorHAnsi"/>
           <w:lang w:val="it-CH" w:eastAsia="en-GB"/>
         </w:rPr>
-        <w:t xml:space="preserve"> - Diario del progetto</w:t>
+        <w:t>6</w:t>
+      </w:r>
+      <w:r>
+        <w:rPr>
+          <w:rFonts w:eastAsia="Times New Roman" w:cstheme="minorHAnsi"/>
+          <w:lang w:val="it-CH" w:eastAsia="en-GB"/>
+        </w:rPr>
+        <w:t xml:space="preserve"> - </w:t>
+      </w:r>
+      <w:r>
+        <w:rPr>
+          <w:rFonts w:eastAsia="Times New Roman" w:cstheme="minorHAnsi"/>
+          <w:lang w:val="it-CH" w:eastAsia="en-GB"/>
+        </w:rPr>
+        <w:t>Stile di codifica; Leggibilità del codice</w:t>
       </w:r>
     </w:p>
     <w:p>
@@ -3659,14 +3631,21 @@
           <w:rFonts w:eastAsia="Times New Roman" w:cstheme="minorHAnsi"/>
           <w:lang w:val="it-CH" w:eastAsia="en-GB"/>
         </w:rPr>
-        <w:t>235 -</w:t>
+        <w:t>250</w:t>
       </w:r>
       <w:r>
         <w:rPr>
           <w:rFonts w:eastAsia="Times New Roman" w:cstheme="minorHAnsi"/>
           <w:lang w:val="it-CH" w:eastAsia="en-GB"/>
         </w:rPr>
-        <w:t xml:space="preserve"> Progettazione con UML</w:t>
+        <w:t xml:space="preserve"> - </w:t>
+      </w:r>
+      <w:r>
+        <w:rPr>
+          <w:rFonts w:eastAsia="Times New Roman" w:cstheme="minorHAnsi"/>
+          <w:lang w:val="it-CH" w:eastAsia="en-GB"/>
+        </w:rPr>
+        <w:t>Separazione dei livelli (Applicazione)</w:t>
       </w:r>
     </w:p>
     <w:p>
@@ -3687,14 +3666,7 @@
           <w:rFonts w:eastAsia="Times New Roman" w:cstheme="minorHAnsi"/>
           <w:lang w:val="it-CH" w:eastAsia="en-GB"/>
         </w:rPr>
-        <w:t xml:space="preserve">165 - </w:t>
-      </w:r>
-      <w:r>
-        <w:rPr>
-          <w:rFonts w:eastAsia="Times New Roman" w:cstheme="minorHAnsi"/>
-          <w:lang w:val="it-CH" w:eastAsia="en-GB"/>
-        </w:rPr>
-        <w:t>Implementazione della soluzione (programmazione)</w:t>
+        <w:t>119 – Utilità</w:t>
       </w:r>
     </w:p>
     <w:p>
@@ -3715,22 +3687,64 @@
           <w:rFonts w:eastAsia="Times New Roman" w:cstheme="minorHAnsi"/>
           <w:lang w:val="it-CH" w:eastAsia="en-GB"/>
         </w:rPr>
-        <w:t>250</w:t>
+        <w:t xml:space="preserve">164 - </w:t>
       </w:r>
       <w:r>
         <w:rPr>
           <w:rFonts w:eastAsia="Times New Roman" w:cstheme="minorHAnsi"/>
           <w:lang w:val="it-CH" w:eastAsia="en-GB"/>
         </w:rPr>
-        <w:t xml:space="preserve"> - </w:t>
-      </w:r>
-      <w:r>
+        <w:t>Codifica: Gestione degli errori</w:t>
+      </w:r>
+    </w:p>
+    <w:p>
+      <w:pPr>
+        <w:pStyle w:val="Paragrafoelenco"/>
+        <w:autoSpaceDE w:val="0"/>
+        <w:autoSpaceDN w:val="0"/>
+        <w:adjustRightInd w:val="0"/>
+        <w:spacing w:after="0" w:line="240" w:lineRule="auto"/>
+        <w:ind w:left="170"/>
         <w:rPr>
           <w:rFonts w:eastAsia="Times New Roman" w:cstheme="minorHAnsi"/>
           <w:lang w:val="it-CH" w:eastAsia="en-GB"/>
         </w:rPr>
-        <w:t>Separazione dei livelli (Applicazione)</w:t>
-      </w:r>
+      </w:pPr>
+      <w:r>
+        <w:rPr>
+          <w:rFonts w:eastAsia="Times New Roman" w:cstheme="minorHAnsi"/>
+          <w:lang w:val="it-CH" w:eastAsia="en-GB"/>
+        </w:rPr>
+        <w:t xml:space="preserve">227 - </w:t>
+      </w:r>
+      <w:r>
+        <w:rPr>
+          <w:rFonts w:eastAsia="Times New Roman" w:cstheme="minorHAnsi"/>
+          <w:lang w:val="it-CH" w:eastAsia="en-GB"/>
+        </w:rPr>
+        <w:t>Rispetto degli standard</w:t>
+      </w:r>
+      <w:r>
+        <w:rPr>
+          <w:rFonts w:eastAsia="Times New Roman" w:cstheme="minorHAnsi"/>
+          <w:lang w:val="it-CH" w:eastAsia="en-GB"/>
+        </w:rPr>
+        <w:t xml:space="preserve"> d’azienda</w:t>
+      </w:r>
+    </w:p>
+    <w:p>
+      <w:pPr>
+        <w:pStyle w:val="Paragrafoelenco"/>
+        <w:autoSpaceDE w:val="0"/>
+        <w:autoSpaceDN w:val="0"/>
+        <w:adjustRightInd w:val="0"/>
+        <w:spacing w:after="0" w:line="240" w:lineRule="auto"/>
+        <w:ind w:left="170"/>
+        <w:rPr>
+          <w:rFonts w:eastAsia="Times New Roman" w:cstheme="minorHAnsi"/>
+          <w:lang w:val="it-CH" w:eastAsia="en-GB"/>
+        </w:rPr>
+      </w:pPr>
     </w:p>
     <w:p>
       <w:pPr>

</xml_diff>